<commit_message>
IIS + háttérkép képek
</commit_message>
<xml_diff>
--- a/Windows képdokumentáció.docx
+++ b/Windows képdokumentáció.docx
@@ -1,6 +1,6 @@
 
 <file path=word/document.xml><?xml version="1.0" encoding="utf-8"?>
-<w:document xmlns:wpc="http://schemas.microsoft.com/office/word/2010/wordprocessingCanvas" xmlns:cx="http://schemas.microsoft.com/office/drawing/2014/chartex" xmlns:cx1="http://schemas.microsoft.com/office/drawing/2015/9/8/chartex" xmlns:cx2="http://schemas.microsoft.com/office/drawing/2015/10/21/chartex" xmlns:cx3="http://schemas.microsoft.com/office/drawing/2016/5/9/chartex" xmlns:cx4="http://schemas.microsoft.com/office/drawing/2016/5/10/chartex" xmlns:cx5="http://schemas.microsoft.com/office/drawing/2016/5/11/chartex" xmlns:cx6="http://schemas.microsoft.com/office/drawing/2016/5/12/chartex" xmlns:cx7="http://schemas.microsoft.com/office/drawing/2016/5/13/chartex" xmlns:cx8="http://schemas.microsoft.com/office/drawing/2016/5/14/chartex" xmlns:mc="http://schemas.openxmlformats.org/markup-compatibility/2006" xmlns:aink="http://schemas.microsoft.com/office/drawing/2016/ink" xmlns:am3d="http://schemas.microsoft.com/office/drawing/2017/model3d" xmlns:o="urn:schemas-microsoft-com:office:office" xmlns:r="http://schemas.openxmlformats.org/officeDocument/2006/relationships" xmlns:m="http://schemas.openxmlformats.org/officeDocument/2006/math" xmlns:v="urn:schemas-microsoft-com:vml" xmlns:wp14="http://schemas.microsoft.com/office/word/2010/wordprocessingDrawing" xmlns:wp="http://schemas.openxmlformats.org/drawingml/2006/wordprocessingDrawing" xmlns:w10="urn:schemas-microsoft-com:office:word" xmlns:w="http://schemas.openxmlformats.org/wordprocessingml/2006/main" xmlns:w14="http://schemas.microsoft.com/office/word/2010/wordml" xmlns:w15="http://schemas.microsoft.com/office/word/2012/wordml" xmlns:w16cid="http://schemas.microsoft.com/office/word/2016/wordml/cid" xmlns:w16se="http://schemas.microsoft.com/office/word/2015/wordml/symex" xmlns:wpg="http://schemas.microsoft.com/office/word/2010/wordprocessingGroup" xmlns:wpi="http://schemas.microsoft.com/office/word/2010/wordprocessingInk" xmlns:wne="http://schemas.microsoft.com/office/word/2006/wordml" xmlns:wps="http://schemas.microsoft.com/office/word/2010/wordprocessingShape" mc:Ignorable="w14 w15 w16se w16cid wp14">
+<w:document xmlns:wpc="http://schemas.microsoft.com/office/word/2010/wordprocessingCanvas" xmlns:cx="http://schemas.microsoft.com/office/drawing/2014/chartex" xmlns:cx1="http://schemas.microsoft.com/office/drawing/2015/9/8/chartex" xmlns:cx2="http://schemas.microsoft.com/office/drawing/2015/10/21/chartex" xmlns:cx3="http://schemas.microsoft.com/office/drawing/2016/5/9/chartex" xmlns:cx4="http://schemas.microsoft.com/office/drawing/2016/5/10/chartex" xmlns:cx5="http://schemas.microsoft.com/office/drawing/2016/5/11/chartex" xmlns:cx6="http://schemas.microsoft.com/office/drawing/2016/5/12/chartex" xmlns:cx7="http://schemas.microsoft.com/office/drawing/2016/5/13/chartex" xmlns:cx8="http://schemas.microsoft.com/office/drawing/2016/5/14/chartex" xmlns:mc="http://schemas.openxmlformats.org/markup-compatibility/2006" xmlns:aink="http://schemas.microsoft.com/office/drawing/2016/ink" xmlns:am3d="http://schemas.microsoft.com/office/drawing/2017/model3d" xmlns:o="urn:schemas-microsoft-com:office:office" xmlns:r="http://schemas.openxmlformats.org/officeDocument/2006/relationships" xmlns:m="http://schemas.openxmlformats.org/officeDocument/2006/math" xmlns:v="urn:schemas-microsoft-com:vml" xmlns:wp14="http://schemas.microsoft.com/office/word/2010/wordprocessingDrawing" xmlns:wp="http://schemas.openxmlformats.org/drawingml/2006/wordprocessingDrawing" xmlns:w10="urn:schemas-microsoft-com:office:word" xmlns:w="http://schemas.openxmlformats.org/wordprocessingml/2006/main" xmlns:w14="http://schemas.microsoft.com/office/word/2010/wordml" xmlns:w15="http://schemas.microsoft.com/office/word/2012/wordml" xmlns:w16cex="http://schemas.microsoft.com/office/word/2018/wordml/cex" xmlns:w16cid="http://schemas.microsoft.com/office/word/2016/wordml/cid" xmlns:w16="http://schemas.microsoft.com/office/word/2018/wordml" xmlns:w16sdtdh="http://schemas.microsoft.com/office/word/2020/wordml/sdtdatahash" xmlns:w16se="http://schemas.microsoft.com/office/word/2015/wordml/symex" xmlns:wpg="http://schemas.microsoft.com/office/word/2010/wordprocessingGroup" xmlns:wpi="http://schemas.microsoft.com/office/word/2010/wordprocessingInk" xmlns:wne="http://schemas.microsoft.com/office/word/2006/wordml" xmlns:wps="http://schemas.microsoft.com/office/word/2010/wordprocessingShape" mc:Ignorable="w14 w15 w16se w16cid w16 w16cex w16sdtdh wp14">
   <w:body>
     <w:p>
       <w:r>
@@ -125,6 +125,9 @@
         </w:drawing>
       </w:r>
       <w:r>
+        <w:rPr>
+          <w:noProof/>
+        </w:rPr>
         <w:drawing>
           <wp:inline distT="0" distB="0" distL="0" distR="0" wp14:anchorId="6615EC7C" wp14:editId="00E427A4">
             <wp:extent cx="5760720" cy="2422525"/>
@@ -161,8 +164,6 @@
           </wp:inline>
         </w:drawing>
       </w:r>
-      <w:bookmarkStart w:id="0" w:name="_GoBack"/>
-      <w:bookmarkEnd w:id="0"/>
       <w:r>
         <w:rPr>
           <w:noProof/>
@@ -491,6 +492,43 @@
         </w:drawing>
       </w:r>
       <w:r>
+        <w:drawing>
+          <wp:inline distT="0" distB="0" distL="0" distR="0" wp14:anchorId="30307426" wp14:editId="16105C42">
+            <wp:extent cx="5760720" cy="3090545"/>
+            <wp:effectExtent l="0" t="0" r="0" b="0"/>
+            <wp:docPr id="2" name="Kép 2"/>
+            <wp:cNvGraphicFramePr>
+              <a:graphicFrameLocks xmlns:a="http://schemas.openxmlformats.org/drawingml/2006/main" noChangeAspect="1"/>
+            </wp:cNvGraphicFramePr>
+            <a:graphic xmlns:a="http://schemas.openxmlformats.org/drawingml/2006/main">
+              <a:graphicData uri="http://schemas.openxmlformats.org/drawingml/2006/picture">
+                <pic:pic xmlns:pic="http://schemas.openxmlformats.org/drawingml/2006/picture">
+                  <pic:nvPicPr>
+                    <pic:cNvPr id="1" name=""/>
+                    <pic:cNvPicPr/>
+                  </pic:nvPicPr>
+                  <pic:blipFill>
+                    <a:blip r:embed="rId16"/>
+                    <a:stretch>
+                      <a:fillRect/>
+                    </a:stretch>
+                  </pic:blipFill>
+                  <pic:spPr>
+                    <a:xfrm>
+                      <a:off x="0" y="0"/>
+                      <a:ext cx="5760720" cy="3090545"/>
+                    </a:xfrm>
+                    <a:prstGeom prst="rect">
+                      <a:avLst/>
+                    </a:prstGeom>
+                  </pic:spPr>
+                </pic:pic>
+              </a:graphicData>
+            </a:graphic>
+          </wp:inline>
+        </w:drawing>
+      </w:r>
+      <w:r>
         <w:rPr>
           <w:noProof/>
         </w:rPr>
@@ -511,7 +549,7 @@
                     <pic:cNvPicPr/>
                   </pic:nvPicPr>
                   <pic:blipFill>
-                    <a:blip r:embed="rId16"/>
+                    <a:blip r:embed="rId17"/>
                     <a:stretch>
                       <a:fillRect/>
                     </a:stretch>
@@ -551,7 +589,7 @@
                     <pic:cNvPicPr/>
                   </pic:nvPicPr>
                   <pic:blipFill>
-                    <a:blip r:embed="rId17"/>
+                    <a:blip r:embed="rId18"/>
                     <a:stretch>
                       <a:fillRect/>
                     </a:stretch>
@@ -592,7 +630,7 @@
                     <pic:cNvPicPr/>
                   </pic:nvPicPr>
                   <pic:blipFill>
-                    <a:blip r:embed="rId18"/>
+                    <a:blip r:embed="rId19"/>
                     <a:stretch>
                       <a:fillRect/>
                     </a:stretch>
@@ -613,10 +651,47 @@
         </w:drawing>
       </w:r>
       <w:r>
-        <w:rPr>
-          <w:noProof/>
-        </w:rPr>
         <w:lastRenderedPageBreak/>
+        <w:drawing>
+          <wp:inline distT="0" distB="0" distL="0" distR="0" wp14:anchorId="21072C76" wp14:editId="12D37A37">
+            <wp:extent cx="5760720" cy="3828415"/>
+            <wp:effectExtent l="0" t="0" r="0" b="635"/>
+            <wp:docPr id="18" name="Kép 18"/>
+            <wp:cNvGraphicFramePr>
+              <a:graphicFrameLocks xmlns:a="http://schemas.openxmlformats.org/drawingml/2006/main" noChangeAspect="1"/>
+            </wp:cNvGraphicFramePr>
+            <a:graphic xmlns:a="http://schemas.openxmlformats.org/drawingml/2006/main">
+              <a:graphicData uri="http://schemas.openxmlformats.org/drawingml/2006/picture">
+                <pic:pic xmlns:pic="http://schemas.openxmlformats.org/drawingml/2006/picture">
+                  <pic:nvPicPr>
+                    <pic:cNvPr id="1" name=""/>
+                    <pic:cNvPicPr/>
+                  </pic:nvPicPr>
+                  <pic:blipFill>
+                    <a:blip r:embed="rId20"/>
+                    <a:stretch>
+                      <a:fillRect/>
+                    </a:stretch>
+                  </pic:blipFill>
+                  <pic:spPr>
+                    <a:xfrm>
+                      <a:off x="0" y="0"/>
+                      <a:ext cx="5760720" cy="3828415"/>
+                    </a:xfrm>
+                    <a:prstGeom prst="rect">
+                      <a:avLst/>
+                    </a:prstGeom>
+                  </pic:spPr>
+                </pic:pic>
+              </a:graphicData>
+            </a:graphic>
+          </wp:inline>
+        </w:drawing>
+      </w:r>
+      <w:r>
+        <w:rPr>
+          <w:noProof/>
+        </w:rPr>
         <w:drawing>
           <wp:inline distT="0" distB="0" distL="0" distR="0" wp14:anchorId="0C3D1492" wp14:editId="47693913">
             <wp:extent cx="5760720" cy="3639820"/>
@@ -633,7 +708,7 @@
                     <pic:cNvPicPr/>
                   </pic:nvPicPr>
                   <pic:blipFill>
-                    <a:blip r:embed="rId19"/>
+                    <a:blip r:embed="rId21"/>
                     <a:stretch>
                       <a:fillRect/>
                     </a:stretch>
@@ -665,7 +740,7 @@
 </file>
 
 <file path=word/styles.xml><?xml version="1.0" encoding="utf-8"?>
-<w:styles xmlns:mc="http://schemas.openxmlformats.org/markup-compatibility/2006" xmlns:r="http://schemas.openxmlformats.org/officeDocument/2006/relationships" xmlns:w="http://schemas.openxmlformats.org/wordprocessingml/2006/main" xmlns:w14="http://schemas.microsoft.com/office/word/2010/wordml" xmlns:w15="http://schemas.microsoft.com/office/word/2012/wordml" xmlns:w16cid="http://schemas.microsoft.com/office/word/2016/wordml/cid" xmlns:w16se="http://schemas.microsoft.com/office/word/2015/wordml/symex" mc:Ignorable="w14 w15 w16se w16cid">
+<w:styles xmlns:mc="http://schemas.openxmlformats.org/markup-compatibility/2006" xmlns:r="http://schemas.openxmlformats.org/officeDocument/2006/relationships" xmlns:w="http://schemas.openxmlformats.org/wordprocessingml/2006/main" xmlns:w14="http://schemas.microsoft.com/office/word/2010/wordml" xmlns:w15="http://schemas.microsoft.com/office/word/2012/wordml" xmlns:w16cex="http://schemas.microsoft.com/office/word/2018/wordml/cex" xmlns:w16cid="http://schemas.microsoft.com/office/word/2016/wordml/cid" xmlns:w16="http://schemas.microsoft.com/office/word/2018/wordml" xmlns:w16sdtdh="http://schemas.microsoft.com/office/word/2020/wordml/sdtdatahash" xmlns:w16se="http://schemas.microsoft.com/office/word/2015/wordml/symex" mc:Ignorable="w14 w15 w16se w16cid w16 w16cex w16sdtdh">
   <w:docDefaults>
     <w:rPrDefault>
       <w:rPr>
@@ -681,7 +756,7 @@
       </w:pPr>
     </w:pPrDefault>
   </w:docDefaults>
-  <w:latentStyles w:defLockedState="0" w:defUIPriority="99" w:defSemiHidden="0" w:defUnhideWhenUsed="0" w:defQFormat="0" w:count="375">
+  <w:latentStyles w:defLockedState="0" w:defUIPriority="99" w:defSemiHidden="0" w:defUnhideWhenUsed="0" w:defQFormat="0" w:count="376">
     <w:lsdException w:name="Normal" w:uiPriority="0" w:qFormat="1"/>
     <w:lsdException w:name="heading 1" w:uiPriority="9" w:qFormat="1"/>
     <w:lsdException w:name="heading 2" w:semiHidden="1" w:uiPriority="9" w:unhideWhenUsed="1" w:qFormat="1"/>
@@ -787,7 +862,6 @@
     <w:lsdException w:name="HTML Sample" w:semiHidden="1" w:unhideWhenUsed="1"/>
     <w:lsdException w:name="HTML Typewriter" w:semiHidden="1" w:unhideWhenUsed="1"/>
     <w:lsdException w:name="HTML Variable" w:semiHidden="1" w:unhideWhenUsed="1"/>
-    <w:lsdException w:name="Normal Table" w:semiHidden="1" w:unhideWhenUsed="1"/>
     <w:lsdException w:name="annotation subject" w:semiHidden="1" w:unhideWhenUsed="1"/>
     <w:lsdException w:name="No List" w:semiHidden="1" w:unhideWhenUsed="1"/>
     <w:lsdException w:name="Outline List 1" w:semiHidden="1" w:unhideWhenUsed="1"/>
@@ -834,10 +908,8 @@
     <w:lsdException w:name="Table Subtle 2" w:semiHidden="1" w:unhideWhenUsed="1"/>
     <w:lsdException w:name="Table Web 1" w:semiHidden="1" w:unhideWhenUsed="1"/>
     <w:lsdException w:name="Table Web 2" w:semiHidden="1" w:unhideWhenUsed="1"/>
-    <w:lsdException w:name="Table Web 3" w:semiHidden="1" w:unhideWhenUsed="1"/>
     <w:lsdException w:name="Balloon Text" w:semiHidden="1" w:unhideWhenUsed="1"/>
     <w:lsdException w:name="Table Grid" w:uiPriority="39"/>
-    <w:lsdException w:name="Table Theme" w:semiHidden="1" w:unhideWhenUsed="1"/>
     <w:lsdException w:name="Placeholder Text" w:semiHidden="1"/>
     <w:lsdException w:name="No Spacing" w:uiPriority="1" w:qFormat="1"/>
     <w:lsdException w:name="Light Shading" w:uiPriority="60"/>
@@ -1057,6 +1129,7 @@
     <w:lsdException w:name="Smart Hyperlink" w:semiHidden="1" w:unhideWhenUsed="1"/>
     <w:lsdException w:name="Hashtag" w:semiHidden="1" w:unhideWhenUsed="1"/>
     <w:lsdException w:name="Unresolved Mention" w:semiHidden="1" w:unhideWhenUsed="1"/>
+    <w:lsdException w:name="Smart Link" w:semiHidden="1" w:unhideWhenUsed="1"/>
   </w:latentStyles>
   <w:style w:type="paragraph" w:default="1" w:styleId="Norml">
     <w:name w:val="Normal"/>

</xml_diff>